<commit_message>
feat: update member transfer table columns layout, address fields in import/export, dynamic email selection, and voting permission rule
</commit_message>
<xml_diff>
--- a/public/2. Mau 11_KND_nhan xet dang vien giup do_DHKT_2025.docx
+++ b/public/2. Mau 11_KND_nhan xet dang vien giup do_DHKT_2025.docx
@@ -224,20 +224,7 @@
               </w:rPr>
             </w:pPr>
             <w:r>
-              <w:rPr>
-                <w:sz w:val="28"/>
-                <w:szCs w:val="28"/>
-                <w:lang w:val="it-IT"/>
-              </w:rPr>
-              <w:t xml:space="preserve">- </w:t>
-            </w:r>
-            <w:r>
-              <w:rPr>
-                <w:sz w:val="28"/>
-                <w:szCs w:val="28"/>
-                <w:lang w:val="it-IT"/>
-              </w:rPr>
-              <w:t>Chi ủy Chi bộ Sinh viên</w:t>
+              <w:t>- Chi ủy Chi bộ {{chi_bo_sinh_hoat}}</w:t>
             </w:r>
           </w:p>
           <w:p>
@@ -250,22 +237,7 @@
               </w:rPr>
             </w:pPr>
             <w:r>
-              <w:rPr>
-                <w:iCs/>
-                <w:sz w:val="28"/>
-                <w:szCs w:val="28"/>
-                <w:lang w:val="it-IT"/>
-              </w:rPr>
-              <w:t xml:space="preserve">- </w:t>
-            </w:r>
-            <w:r>
-              <w:rPr>
-                <w:iCs/>
-                <w:sz w:val="28"/>
-                <w:szCs w:val="28"/>
-                <w:lang w:val="it-IT"/>
-              </w:rPr>
-              <w:t>Đảng ủy Trường Đại học Kinh tế</w:t>
+              <w:t>- Đảng ủy {{dang_uy_truong}}</w:t>
             </w:r>
           </w:p>
         </w:tc>
@@ -309,6 +281,7 @@
                 <w:kern w:val="2"/>
                 <w:sz w:val="28"/>
                 <w:szCs w:val="28"/>
+                <w:lang w:val="it-IT"/>
               </w:rPr>
             </w:pPr>
             <w:r>
@@ -316,14 +289,16 @@
                 <w:kern w:val="2"/>
                 <w:sz w:val="28"/>
                 <w:szCs w:val="28"/>
+                <w:lang w:val="it-IT"/>
               </w:rPr>
-              <w:t>Tôi là: Lê Vĩnh Diện</w:t>
+              <w:t>Tôi là: {{dvhd}}</w:t>
             </w:r>
             <w:r>
               <w:rPr>
                 <w:kern w:val="2"/>
                 <w:sz w:val="28"/>
                 <w:szCs w:val="28"/>
+                <w:lang w:val="it-IT"/>
               </w:rPr>
               <w:tab/>
             </w:r>
@@ -332,6 +307,7 @@
                 <w:kern w:val="2"/>
                 <w:sz w:val="28"/>
                 <w:szCs w:val="28"/>
+                <w:lang w:val="it-IT"/>
               </w:rPr>
               <w:tab/>
             </w:r>
@@ -341,6 +317,7 @@
                 <w:kern w:val="2"/>
                 <w:sz w:val="28"/>
                 <w:szCs w:val="28"/>
+                <w:lang w:val="it-IT"/>
               </w:rPr>
               <w:t xml:space="preserve"> </w:t>
             </w:r>
@@ -368,7 +345,7 @@
                 <w:sz w:val="28"/>
                 <w:szCs w:val="28"/>
               </w:rPr>
-              <w:t>Ngày sinh: 01/04/2004</w:t>
+              <w:t>Ngày sinh: {{dvhd_ngay_sinh_formatted}}</w:t>
             </w:r>
           </w:p>
         </w:tc>
@@ -393,23 +370,8 @@
               </w:rPr>
             </w:pPr>
             <w:r>
-              <w:rPr>
-                <w:kern w:val="2"/>
-                <w:sz w:val="28"/>
-                <w:szCs w:val="28"/>
-              </w:rPr>
-              <w:t xml:space="preserve">Ngày vào Đảng: </w:t>
+              <w:t>Ngày vào Đảng: {{dvhd_ngay_vao_dang}}</w:t>
             </w:r>
-            <w:bookmarkStart w:id="1" w:name="_Hlk231488814"/>
-            <w:r>
-              <w:rPr>
-                <w:kern w:val="2"/>
-                <w:sz w:val="28"/>
-                <w:szCs w:val="28"/>
-              </w:rPr>
-              <w:t>26/07/2022</w:t>
-            </w:r>
-            <w:bookmarkEnd w:id="1"/>
           </w:p>
         </w:tc>
         <w:tc>
@@ -428,23 +390,8 @@
               </w:rPr>
             </w:pPr>
             <w:r>
-              <w:rPr>
-                <w:kern w:val="2"/>
-                <w:sz w:val="28"/>
-                <w:szCs w:val="28"/>
-              </w:rPr>
-              <w:t xml:space="preserve">Ngày chính thức: </w:t>
+              <w:t>Ngày chính thức: {{dvhd_ngay_chinh_thuc}}</w:t>
             </w:r>
-            <w:bookmarkStart w:id="2" w:name="_Hlk231488819"/>
-            <w:r>
-              <w:rPr>
-                <w:kern w:val="2"/>
-                <w:sz w:val="28"/>
-                <w:szCs w:val="28"/>
-              </w:rPr>
-              <w:t>26/07/2023</w:t>
-            </w:r>
-            <w:bookmarkEnd w:id="2"/>
           </w:p>
         </w:tc>
       </w:tr>
@@ -473,7 +420,7 @@
                 <w:sz w:val="28"/>
                 <w:szCs w:val="28"/>
               </w:rPr>
-              <w:t>Hiện đang sinh hoạt tại Chi bộ Sinh viên</w:t>
+              <w:t>Hiện đang sinh hoạt tại Chi bộ {{chi_bo_sinh_hoat}}</w:t>
             </w:r>
           </w:p>
           <w:p>
@@ -487,508 +434,7 @@
               </w:rPr>
             </w:pPr>
             <w:r>
-              <w:rPr>
-                <w:sz w:val="28"/>
-                <w:szCs w:val="28"/>
-              </w:rPr>
-              <w:t>Ng</w:t>
-            </w:r>
-            <w:r>
-              <w:rPr>
-                <w:sz w:val="28"/>
-                <w:szCs w:val="28"/>
-              </w:rPr>
-              <w:t>ày</w:t>
-            </w:r>
-            <w:r>
-              <w:rPr>
-                <w:sz w:val="28"/>
-                <w:szCs w:val="28"/>
-              </w:rPr>
-              <w:t xml:space="preserve">      th</w:t>
-            </w:r>
-            <w:r>
-              <w:rPr>
-                <w:sz w:val="28"/>
-                <w:szCs w:val="28"/>
-              </w:rPr>
-              <w:t>áng</w:t>
-            </w:r>
-            <w:r>
-              <w:rPr>
-                <w:sz w:val="28"/>
-                <w:szCs w:val="28"/>
-              </w:rPr>
-              <w:t xml:space="preserve">       n</w:t>
-            </w:r>
-            <w:r>
-              <w:rPr>
-                <w:sz w:val="28"/>
-                <w:szCs w:val="28"/>
-              </w:rPr>
-              <w:t>ă</w:t>
-            </w:r>
-            <w:r>
-              <w:rPr>
-                <w:sz w:val="28"/>
-                <w:szCs w:val="28"/>
-              </w:rPr>
-              <w:t xml:space="preserve">m 2026 </w:t>
-            </w:r>
-            <w:r>
-              <w:rPr>
-                <w:sz w:val="28"/>
-                <w:szCs w:val="28"/>
-              </w:rPr>
-              <w:t>đ</w:t>
-            </w:r>
-            <w:r>
-              <w:rPr>
-                <w:sz w:val="28"/>
-                <w:szCs w:val="28"/>
-              </w:rPr>
-              <w:t>ược</w:t>
-            </w:r>
-            <w:r>
-              <w:rPr>
-                <w:sz w:val="28"/>
-                <w:szCs w:val="28"/>
-              </w:rPr>
-              <w:t xml:space="preserve"> Chi b</w:t>
-            </w:r>
-            <w:r>
-              <w:rPr>
-                <w:sz w:val="28"/>
-                <w:szCs w:val="28"/>
-              </w:rPr>
-              <w:t>ộ</w:t>
-            </w:r>
-            <w:r>
-              <w:rPr>
-                <w:sz w:val="28"/>
-                <w:szCs w:val="28"/>
-              </w:rPr>
-              <w:t xml:space="preserve"> ph</w:t>
-            </w:r>
-            <w:r>
-              <w:rPr>
-                <w:sz w:val="28"/>
-                <w:szCs w:val="28"/>
-              </w:rPr>
-              <w:t>â</w:t>
-            </w:r>
-            <w:r>
-              <w:rPr>
-                <w:sz w:val="28"/>
-                <w:szCs w:val="28"/>
-              </w:rPr>
-              <w:t>n c</w:t>
-            </w:r>
-            <w:r>
-              <w:rPr>
-                <w:sz w:val="28"/>
-                <w:szCs w:val="28"/>
-              </w:rPr>
-              <w:t>ô</w:t>
-            </w:r>
-            <w:r>
-              <w:rPr>
-                <w:sz w:val="28"/>
-                <w:szCs w:val="28"/>
-              </w:rPr>
-              <w:t>ng gi</w:t>
-            </w:r>
-            <w:r>
-              <w:rPr>
-                <w:sz w:val="28"/>
-                <w:szCs w:val="28"/>
-              </w:rPr>
-              <w:t>úp</w:t>
-            </w:r>
-            <w:r>
-              <w:rPr>
-                <w:sz w:val="28"/>
-                <w:szCs w:val="28"/>
-              </w:rPr>
-              <w:t xml:space="preserve"> </w:t>
-            </w:r>
-            <w:r>
-              <w:rPr>
-                <w:sz w:val="28"/>
-                <w:szCs w:val="28"/>
-              </w:rPr>
-              <w:t>đỡ</w:t>
-            </w:r>
-            <w:r>
-              <w:rPr>
-                <w:sz w:val="28"/>
-                <w:szCs w:val="28"/>
-              </w:rPr>
-              <w:t xml:space="preserve"> </w:t>
-            </w:r>
-            <w:r>
-              <w:rPr>
-                <w:sz w:val="28"/>
-                <w:szCs w:val="28"/>
-              </w:rPr>
-              <w:t>đảng</w:t>
-            </w:r>
-            <w:r>
-              <w:rPr>
-                <w:sz w:val="28"/>
-                <w:szCs w:val="28"/>
-              </w:rPr>
-              <w:t xml:space="preserve"> vi</w:t>
-            </w:r>
-            <w:r>
-              <w:rPr>
-                <w:sz w:val="28"/>
-                <w:szCs w:val="28"/>
-              </w:rPr>
-              <w:t>ê</w:t>
-            </w:r>
-            <w:r>
-              <w:rPr>
-                <w:sz w:val="28"/>
-                <w:szCs w:val="28"/>
-              </w:rPr>
-              <w:t>n d</w:t>
-            </w:r>
-            <w:r>
-              <w:rPr>
-                <w:sz w:val="28"/>
-                <w:szCs w:val="28"/>
-              </w:rPr>
-              <w:t>ự</w:t>
-            </w:r>
-            <w:r>
-              <w:rPr>
-                <w:sz w:val="28"/>
-                <w:szCs w:val="28"/>
-              </w:rPr>
-              <w:t xml:space="preserve"> b</w:t>
-            </w:r>
-            <w:r>
-              <w:rPr>
-                <w:sz w:val="28"/>
-                <w:szCs w:val="28"/>
-              </w:rPr>
-              <w:t>ị</w:t>
-            </w:r>
-            <w:r>
-              <w:rPr>
-                <w:sz w:val="28"/>
-                <w:szCs w:val="28"/>
-              </w:rPr>
-              <w:t>: Nguyễn Hữu Ái Quốc được kết nạp vào Đảng ngày 30 tháng 5 năm 2025, ph</w:t>
-            </w:r>
-            <w:r>
-              <w:rPr>
-                <w:sz w:val="28"/>
-                <w:szCs w:val="28"/>
-              </w:rPr>
-              <w:t>ấn</w:t>
-            </w:r>
-            <w:r>
-              <w:rPr>
-                <w:sz w:val="28"/>
-                <w:szCs w:val="28"/>
-              </w:rPr>
-              <w:t xml:space="preserve"> </w:t>
-            </w:r>
-            <w:r>
-              <w:rPr>
-                <w:sz w:val="28"/>
-                <w:szCs w:val="28"/>
-              </w:rPr>
-              <w:t>đấu</w:t>
-            </w:r>
-            <w:r>
-              <w:rPr>
-                <w:sz w:val="28"/>
-                <w:szCs w:val="28"/>
-              </w:rPr>
-              <w:t xml:space="preserve"> tr</w:t>
-            </w:r>
-            <w:r>
-              <w:rPr>
-                <w:sz w:val="28"/>
-                <w:szCs w:val="28"/>
-              </w:rPr>
-              <w:t>ở</w:t>
-            </w:r>
-            <w:r>
-              <w:rPr>
-                <w:sz w:val="28"/>
-                <w:szCs w:val="28"/>
-              </w:rPr>
-              <w:t xml:space="preserve"> th</w:t>
-            </w:r>
-            <w:r>
-              <w:rPr>
-                <w:sz w:val="28"/>
-                <w:szCs w:val="28"/>
-              </w:rPr>
-              <w:t>ành</w:t>
-            </w:r>
-            <w:r>
-              <w:rPr>
-                <w:sz w:val="28"/>
-                <w:szCs w:val="28"/>
-              </w:rPr>
-              <w:t xml:space="preserve"> </w:t>
-            </w:r>
-            <w:r>
-              <w:rPr>
-                <w:sz w:val="28"/>
-                <w:szCs w:val="28"/>
-              </w:rPr>
-              <w:t>đảng</w:t>
-            </w:r>
-            <w:r>
-              <w:rPr>
-                <w:sz w:val="28"/>
-                <w:szCs w:val="28"/>
-              </w:rPr>
-              <w:t xml:space="preserve"> vi</w:t>
-            </w:r>
-            <w:r>
-              <w:rPr>
-                <w:sz w:val="28"/>
-                <w:szCs w:val="28"/>
-              </w:rPr>
-              <w:t>ên</w:t>
-            </w:r>
-            <w:r>
-              <w:rPr>
-                <w:sz w:val="28"/>
-                <w:szCs w:val="28"/>
-              </w:rPr>
-              <w:t xml:space="preserve"> ch</w:t>
-            </w:r>
-            <w:r>
-              <w:rPr>
-                <w:sz w:val="28"/>
-                <w:szCs w:val="28"/>
-              </w:rPr>
-              <w:t>ính</w:t>
-            </w:r>
-            <w:r>
-              <w:rPr>
-                <w:sz w:val="28"/>
-                <w:szCs w:val="28"/>
-              </w:rPr>
-              <w:t xml:space="preserve"> th</w:t>
-            </w:r>
-            <w:r>
-              <w:rPr>
-                <w:sz w:val="28"/>
-                <w:szCs w:val="28"/>
-              </w:rPr>
-              <w:t>ức</w:t>
-            </w:r>
-            <w:r>
-              <w:rPr>
-                <w:sz w:val="28"/>
-                <w:szCs w:val="28"/>
-              </w:rPr>
-              <w:t>; nay xin b</w:t>
-            </w:r>
-            <w:r>
-              <w:rPr>
-                <w:sz w:val="28"/>
-                <w:szCs w:val="28"/>
-              </w:rPr>
-              <w:t>áo</w:t>
-            </w:r>
-            <w:r>
-              <w:rPr>
-                <w:sz w:val="28"/>
-                <w:szCs w:val="28"/>
-              </w:rPr>
-              <w:t xml:space="preserve"> c</w:t>
-            </w:r>
-            <w:r>
-              <w:rPr>
-                <w:sz w:val="28"/>
-                <w:szCs w:val="28"/>
-              </w:rPr>
-              <w:t>áo</w:t>
-            </w:r>
-            <w:r>
-              <w:rPr>
-                <w:sz w:val="28"/>
-                <w:szCs w:val="28"/>
-              </w:rPr>
-              <w:t xml:space="preserve"> Chi b</w:t>
-            </w:r>
-            <w:r>
-              <w:rPr>
-                <w:sz w:val="28"/>
-                <w:szCs w:val="28"/>
-              </w:rPr>
-              <w:t>ộ</w:t>
-            </w:r>
-            <w:r>
-              <w:rPr>
-                <w:sz w:val="28"/>
-                <w:szCs w:val="28"/>
-              </w:rPr>
-              <w:t xml:space="preserve"> nh</w:t>
-            </w:r>
-            <w:r>
-              <w:rPr>
-                <w:sz w:val="28"/>
-                <w:szCs w:val="28"/>
-              </w:rPr>
-              <w:t>ững</w:t>
-            </w:r>
-            <w:r>
-              <w:rPr>
-                <w:sz w:val="28"/>
-                <w:szCs w:val="28"/>
-              </w:rPr>
-              <w:t xml:space="preserve"> v</w:t>
-            </w:r>
-            <w:r>
-              <w:rPr>
-                <w:sz w:val="28"/>
-                <w:szCs w:val="28"/>
-              </w:rPr>
-              <w:t>ấn</w:t>
-            </w:r>
-            <w:r>
-              <w:rPr>
-                <w:sz w:val="28"/>
-                <w:szCs w:val="28"/>
-              </w:rPr>
-              <w:t xml:space="preserve"> </w:t>
-            </w:r>
-            <w:r>
-              <w:rPr>
-                <w:sz w:val="28"/>
-                <w:szCs w:val="28"/>
-              </w:rPr>
-              <w:t>đề</w:t>
-            </w:r>
-            <w:r>
-              <w:rPr>
-                <w:sz w:val="28"/>
-                <w:szCs w:val="28"/>
-              </w:rPr>
-              <w:t xml:space="preserve"> ch</w:t>
-            </w:r>
-            <w:r>
-              <w:rPr>
-                <w:sz w:val="28"/>
-                <w:szCs w:val="28"/>
-              </w:rPr>
-              <w:t>ủ</w:t>
-            </w:r>
-            <w:r>
-              <w:rPr>
-                <w:sz w:val="28"/>
-                <w:szCs w:val="28"/>
-              </w:rPr>
-              <w:t xml:space="preserve"> y</w:t>
-            </w:r>
-            <w:r>
-              <w:rPr>
-                <w:sz w:val="28"/>
-                <w:szCs w:val="28"/>
-              </w:rPr>
-              <w:t>ếu</w:t>
-            </w:r>
-            <w:r>
-              <w:rPr>
-                <w:sz w:val="28"/>
-                <w:szCs w:val="28"/>
-              </w:rPr>
-              <w:t xml:space="preserve"> c</w:t>
-            </w:r>
-            <w:r>
-              <w:rPr>
-                <w:sz w:val="28"/>
-                <w:szCs w:val="28"/>
-              </w:rPr>
-              <w:t>ủa</w:t>
-            </w:r>
-            <w:r>
-              <w:rPr>
-                <w:sz w:val="28"/>
-                <w:szCs w:val="28"/>
-              </w:rPr>
-              <w:t xml:space="preserve"> </w:t>
-            </w:r>
-            <w:r>
-              <w:rPr>
-                <w:sz w:val="28"/>
-                <w:szCs w:val="28"/>
-              </w:rPr>
-              <w:t>đảng</w:t>
-            </w:r>
-            <w:r>
-              <w:rPr>
-                <w:sz w:val="28"/>
-                <w:szCs w:val="28"/>
-              </w:rPr>
-              <w:t xml:space="preserve"> vi</w:t>
-            </w:r>
-            <w:r>
-              <w:rPr>
-                <w:sz w:val="28"/>
-                <w:szCs w:val="28"/>
-              </w:rPr>
-              <w:t>ê</w:t>
-            </w:r>
-            <w:r>
-              <w:rPr>
-                <w:sz w:val="28"/>
-                <w:szCs w:val="28"/>
-              </w:rPr>
-              <w:t>n d</w:t>
-            </w:r>
-            <w:r>
-              <w:rPr>
-                <w:sz w:val="28"/>
-                <w:szCs w:val="28"/>
-              </w:rPr>
-              <w:t>ự</w:t>
-            </w:r>
-            <w:r>
-              <w:rPr>
-                <w:sz w:val="28"/>
-                <w:szCs w:val="28"/>
-              </w:rPr>
-              <w:t xml:space="preserve"> b</w:t>
-            </w:r>
-            <w:r>
-              <w:rPr>
-                <w:sz w:val="28"/>
-                <w:szCs w:val="28"/>
-              </w:rPr>
-              <w:t>ị</w:t>
-            </w:r>
-            <w:r>
-              <w:rPr>
-                <w:sz w:val="28"/>
-                <w:szCs w:val="28"/>
-              </w:rPr>
-              <w:t xml:space="preserve"> nh</w:t>
-            </w:r>
-            <w:r>
-              <w:rPr>
-                <w:sz w:val="28"/>
-                <w:szCs w:val="28"/>
-              </w:rPr>
-              <w:t>ư</w:t>
-            </w:r>
-            <w:r>
-              <w:rPr>
-                <w:sz w:val="28"/>
-                <w:szCs w:val="28"/>
-              </w:rPr>
-              <w:t xml:space="preserve"> sau:</w:t>
+              <w:t>Ngày {{ngay_phan_cong_d}} tháng {{ngay_phan_cong_m}} năm {{ngay_phan_cong_y}} được Chi bộ phân công giúp đỡ đảng viên dự bị: {{ho_ten}} được kết nạp vào Đảng ngày {{ngay_vao_dang_d}} tháng {{ngay_vao_dang_m}} năm {{ngay_vao_dang_y}}, phấn đấu trở thành đảng viên chính thức; nay xin báo cáo Chi bộ những vấn đề chủ yếu của đảng viên dự bị như sau:</w:t>
             </w:r>
           </w:p>
         </w:tc>
@@ -1594,7 +1040,7 @@
           <w:sz w:val="28"/>
           <w:szCs w:val="28"/>
         </w:rPr>
-        <w:t xml:space="preserve">Nguyễn Hữu Ái Quốc </w:t>
+        <w:t xml:space="preserve">{{ho_ten}} </w:t>
       </w:r>
       <w:r>
         <w:rPr>
@@ -1884,76 +1330,7 @@
         </w:rPr>
       </w:pPr>
       <w:r>
-        <w:rPr>
-          <w:i/>
-          <w:sz w:val="28"/>
-          <w:szCs w:val="28"/>
-        </w:rPr>
-        <w:t xml:space="preserve">              </w:t>
-      </w:r>
-      <w:r>
-        <w:rPr>
-          <w:i/>
-          <w:sz w:val="28"/>
-          <w:szCs w:val="28"/>
-        </w:rPr>
-        <w:t xml:space="preserve">                            </w:t>
-      </w:r>
-      <w:r>
-        <w:rPr>
-          <w:i/>
-          <w:sz w:val="28"/>
-          <w:szCs w:val="28"/>
-        </w:rPr>
-        <w:t xml:space="preserve">Đà Nẵng, </w:t>
-      </w:r>
-      <w:r>
-        <w:rPr>
-          <w:i/>
-          <w:sz w:val="28"/>
-          <w:szCs w:val="28"/>
-        </w:rPr>
-        <w:t xml:space="preserve">ngày </w:t>
-      </w:r>
-      <w:r>
-        <w:rPr>
-          <w:i/>
-          <w:sz w:val="28"/>
-          <w:szCs w:val="28"/>
-        </w:rPr>
-        <w:t xml:space="preserve">     </w:t>
-      </w:r>
-      <w:r>
-        <w:rPr>
-          <w:i/>
-          <w:sz w:val="28"/>
-          <w:szCs w:val="28"/>
-        </w:rPr>
-        <w:t xml:space="preserve">  tháng       năm</w:t>
-      </w:r>
-      <w:r>
-        <w:rPr>
-          <w:i/>
-          <w:sz w:val="28"/>
-          <w:szCs w:val="28"/>
-        </w:rPr>
-        <w:t xml:space="preserve"> 2026</w:t>
-      </w:r>
-      <w:r>
-        <w:rPr>
-          <w:i/>
-          <w:sz w:val="28"/>
-          <w:szCs w:val="28"/>
-        </w:rPr>
-        <w:t xml:space="preserve"> </w:t>
-      </w:r>
-      <w:r>
-        <w:rPr>
-          <w:i/>
-          <w:sz w:val="28"/>
-          <w:szCs w:val="28"/>
-        </w:rPr>
-        <w:t xml:space="preserve"> </w:t>
+        <w:t xml:space="preserve">                                          {{tinh_tp}}, ngày {{ngay_ky_d}} tháng {{ngay_ky_m}} năm {{ngay_ky_y}}  </w:t>
       </w:r>
     </w:p>
     <w:p>
@@ -2064,7 +1441,7 @@
           <w:sz w:val="28"/>
           <w:szCs w:val="28"/>
         </w:rPr>
-        <w:t>Lê Vĩnh Diện</w:t>
+        <w:t>{{dvhd}}</w:t>
       </w:r>
     </w:p>
     <w:sectPr>

</xml_diff>

<commit_message>
feat: align party member profile fields and editing with admin view
</commit_message>
<xml_diff>
--- a/public/2. Mau 11_KND_nhan xet dang vien giup do_DHKT_2025.docx
+++ b/public/2. Mau 11_KND_nhan xet dang vien giup do_DHKT_2025.docx
@@ -182,6 +182,9 @@
         <w:gridCol w:w="6422"/>
       </w:tblGrid>
       <w:tr>
+        <w:trPr>
+          <w:trHeight w:val="307"/>
+        </w:trPr>
         <w:tc>
           <w:tcPr>
             <w:tcW w:w="1634" w:type="pct"/>
@@ -224,7 +227,20 @@
               </w:rPr>
             </w:pPr>
             <w:r>
-              <w:t>- Chi ủy Chi bộ {{chi_bo_sinh_hoat}}</w:t>
+              <w:rPr>
+                <w:sz w:val="28"/>
+                <w:szCs w:val="28"/>
+                <w:lang w:val="it-IT"/>
+              </w:rPr>
+              <w:t xml:space="preserve">- Chi ủy Chi bộ </w:t>
+            </w:r>
+            <w:r>
+              <w:rPr>
+                <w:sz w:val="28"/>
+                <w:szCs w:val="28"/>
+                <w:lang w:val="it-IT"/>
+              </w:rPr>
+              <w:t>Sinh viên</w:t>
             </w:r>
           </w:p>
           <w:p>
@@ -237,7 +253,20 @@
               </w:rPr>
             </w:pPr>
             <w:r>
-              <w:t>- Đảng ủy {{dang_uy_truong}}</w:t>
+              <w:rPr>
+                <w:sz w:val="28"/>
+                <w:szCs w:val="28"/>
+                <w:lang w:val="it-IT"/>
+              </w:rPr>
+              <w:t xml:space="preserve">- Đảng ủy </w:t>
+            </w:r>
+            <w:r>
+              <w:rPr>
+                <w:sz w:val="28"/>
+                <w:szCs w:val="28"/>
+                <w:lang w:val="it-IT"/>
+              </w:rPr>
+              <w:t>Trường Đại học Kinh tế</w:t>
             </w:r>
           </w:p>
         </w:tc>
@@ -256,12 +285,13 @@
     </w:p>
     <w:tbl>
       <w:tblPr>
-        <w:tblW w:w="5000" w:type="pct"/>
+        <w:tblW w:w="5126" w:type="pct"/>
+        <w:tblInd w:w="-142" w:type="dxa"/>
         <w:tblLook w:val="04A0" w:firstRow="1" w:lastRow="0" w:firstColumn="1" w:lastColumn="0" w:noHBand="0" w:noVBand="1"/>
       </w:tblPr>
       <w:tblGrid>
         <w:gridCol w:w="5045"/>
-        <w:gridCol w:w="4495"/>
+        <w:gridCol w:w="4735"/>
       </w:tblGrid>
       <w:tr>
         <w:trPr>
@@ -269,7 +299,7 @@
         </w:trPr>
         <w:tc>
           <w:tcPr>
-            <w:tcW w:w="2644" w:type="pct"/>
+            <w:tcW w:w="2579" w:type="pct"/>
           </w:tcPr>
           <w:p>
             <w:pPr>
@@ -326,7 +356,7 @@
         </w:tc>
         <w:tc>
           <w:tcPr>
-            <w:tcW w:w="2356" w:type="pct"/>
+            <w:tcW w:w="2421" w:type="pct"/>
           </w:tcPr>
           <w:p>
             <w:pPr>
@@ -356,7 +386,7 @@
         </w:trPr>
         <w:tc>
           <w:tcPr>
-            <w:tcW w:w="2644" w:type="pct"/>
+            <w:tcW w:w="2579" w:type="pct"/>
           </w:tcPr>
           <w:p>
             <w:pPr>
@@ -370,13 +400,17 @@
               </w:rPr>
             </w:pPr>
             <w:r>
+              <w:rPr>
+                <w:sz w:val="28"/>
+                <w:szCs w:val="28"/>
+              </w:rPr>
               <w:t>Ngày vào Đảng: {{dvhd_ngay_vao_dang}}</w:t>
             </w:r>
           </w:p>
         </w:tc>
         <w:tc>
           <w:tcPr>
-            <w:tcW w:w="2356" w:type="pct"/>
+            <w:tcW w:w="2421" w:type="pct"/>
           </w:tcPr>
           <w:p>
             <w:pPr>
@@ -390,6 +424,10 @@
               </w:rPr>
             </w:pPr>
             <w:r>
+              <w:rPr>
+                <w:sz w:val="28"/>
+                <w:szCs w:val="28"/>
+              </w:rPr>
               <w:t>Ngày chính thức: {{dvhd_ngay_chinh_thuc}}</w:t>
             </w:r>
           </w:p>
@@ -434,6 +472,10 @@
               </w:rPr>
             </w:pPr>
             <w:r>
+              <w:rPr>
+                <w:sz w:val="28"/>
+                <w:szCs w:val="28"/>
+              </w:rPr>
               <w:t>Ngày {{ngay_phan_cong_d}} tháng {{ngay_phan_cong_m}} năm {{ngay_phan_cong_y}} được Chi bộ phân công giúp đỡ đảng viên dự bị: {{ho_ten}} được kết nạp vào Đảng ngày {{ngay_vao_dang_d}} tháng {{ngay_vao_dang_m}} năm {{ngay_vao_dang_y}}, phấn đấu trở thành đảng viên chính thức; nay xin báo cáo Chi bộ những vấn đề chủ yếu của đảng viên dự bị như sau:</w:t>
             </w:r>
           </w:p>
@@ -606,63 +648,21 @@
           <w:sz w:val="28"/>
           <w:szCs w:val="28"/>
         </w:rPr>
-        <w:t>Đối</w:t>
-      </w:r>
-      <w:r>
-        <w:rPr>
-          <w:sz w:val="28"/>
-          <w:szCs w:val="28"/>
-        </w:rPr>
-        <w:t xml:space="preserve"> chi</w:t>
-      </w:r>
-      <w:r>
-        <w:rPr>
-          <w:sz w:val="28"/>
-          <w:szCs w:val="28"/>
-        </w:rPr>
-        <w:t>ếu</w:t>
-      </w:r>
-      <w:r>
-        <w:rPr>
-          <w:sz w:val="28"/>
-          <w:szCs w:val="28"/>
-        </w:rPr>
-        <w:t xml:space="preserve"> v</w:t>
-      </w:r>
-      <w:r>
-        <w:rPr>
-          <w:sz w:val="28"/>
-          <w:szCs w:val="28"/>
-        </w:rPr>
-        <w:t>ới</w:t>
-      </w:r>
-      <w:r>
-        <w:rPr>
-          <w:sz w:val="28"/>
-          <w:szCs w:val="28"/>
-        </w:rPr>
-        <w:t xml:space="preserve"> ti</w:t>
-      </w:r>
-      <w:r>
-        <w:rPr>
-          <w:sz w:val="28"/>
-          <w:szCs w:val="28"/>
-        </w:rPr>
-        <w:t>ê</w:t>
-      </w:r>
-      <w:r>
-        <w:rPr>
-          <w:sz w:val="28"/>
-          <w:szCs w:val="28"/>
-        </w:rPr>
-        <w:t>u chu</w:t>
-      </w:r>
-      <w:r>
-        <w:rPr>
-          <w:sz w:val="28"/>
-          <w:szCs w:val="28"/>
-        </w:rPr>
-        <w:t>ẩn</w:t>
+        <w:t xml:space="preserve">Đối chiếu với tiêu chuẩn đảng viên và kết quả phấn đấu rèn luyện của đảng viên dự bị, tôi đề nghị </w:t>
+      </w:r>
+      <w:r>
+        <w:rPr>
+          <w:sz w:val="28"/>
+          <w:szCs w:val="28"/>
+        </w:rPr>
+        <w:t>C</w:t>
+      </w:r>
+      <w:r>
+        <w:rPr>
+          <w:sz w:val="28"/>
+          <w:szCs w:val="28"/>
+        </w:rPr>
+        <w:t>hi bộ xét, đề nghị công nhận đồng chí</w:t>
       </w:r>
       <w:r>
         <w:rPr>
@@ -676,370 +676,6 @@
           <w:sz w:val="28"/>
           <w:szCs w:val="28"/>
         </w:rPr>
-        <w:t>đảng</w:t>
-      </w:r>
-      <w:r>
-        <w:rPr>
-          <w:sz w:val="28"/>
-          <w:szCs w:val="28"/>
-        </w:rPr>
-        <w:t xml:space="preserve"> vi</w:t>
-      </w:r>
-      <w:r>
-        <w:rPr>
-          <w:sz w:val="28"/>
-          <w:szCs w:val="28"/>
-        </w:rPr>
-        <w:t>ê</w:t>
-      </w:r>
-      <w:r>
-        <w:rPr>
-          <w:sz w:val="28"/>
-          <w:szCs w:val="28"/>
-        </w:rPr>
-        <w:t>n v</w:t>
-      </w:r>
-      <w:r>
-        <w:rPr>
-          <w:sz w:val="28"/>
-          <w:szCs w:val="28"/>
-        </w:rPr>
-        <w:t>à</w:t>
-      </w:r>
-      <w:r>
-        <w:rPr>
-          <w:sz w:val="28"/>
-          <w:szCs w:val="28"/>
-        </w:rPr>
-        <w:t xml:space="preserve"> k</w:t>
-      </w:r>
-      <w:r>
-        <w:rPr>
-          <w:sz w:val="28"/>
-          <w:szCs w:val="28"/>
-        </w:rPr>
-        <w:t>ết</w:t>
-      </w:r>
-      <w:r>
-        <w:rPr>
-          <w:sz w:val="28"/>
-          <w:szCs w:val="28"/>
-        </w:rPr>
-        <w:t xml:space="preserve"> qu</w:t>
-      </w:r>
-      <w:r>
-        <w:rPr>
-          <w:sz w:val="28"/>
-          <w:szCs w:val="28"/>
-        </w:rPr>
-        <w:t>ả</w:t>
-      </w:r>
-      <w:r>
-        <w:rPr>
-          <w:sz w:val="28"/>
-          <w:szCs w:val="28"/>
-        </w:rPr>
-        <w:t xml:space="preserve"> ph</w:t>
-      </w:r>
-      <w:r>
-        <w:rPr>
-          <w:sz w:val="28"/>
-          <w:szCs w:val="28"/>
-        </w:rPr>
-        <w:t>ấn</w:t>
-      </w:r>
-      <w:r>
-        <w:rPr>
-          <w:sz w:val="28"/>
-          <w:szCs w:val="28"/>
-        </w:rPr>
-        <w:t xml:space="preserve"> </w:t>
-      </w:r>
-      <w:r>
-        <w:rPr>
-          <w:sz w:val="28"/>
-          <w:szCs w:val="28"/>
-        </w:rPr>
-        <w:t>đấu</w:t>
-      </w:r>
-      <w:r>
-        <w:rPr>
-          <w:sz w:val="28"/>
-          <w:szCs w:val="28"/>
-        </w:rPr>
-        <w:t xml:space="preserve"> r</w:t>
-      </w:r>
-      <w:r>
-        <w:rPr>
-          <w:sz w:val="28"/>
-          <w:szCs w:val="28"/>
-        </w:rPr>
-        <w:t>èn</w:t>
-      </w:r>
-      <w:r>
-        <w:rPr>
-          <w:sz w:val="28"/>
-          <w:szCs w:val="28"/>
-        </w:rPr>
-        <w:t xml:space="preserve"> luy</w:t>
-      </w:r>
-      <w:r>
-        <w:rPr>
-          <w:sz w:val="28"/>
-          <w:szCs w:val="28"/>
-        </w:rPr>
-        <w:t>ện</w:t>
-      </w:r>
-      <w:r>
-        <w:rPr>
-          <w:sz w:val="28"/>
-          <w:szCs w:val="28"/>
-        </w:rPr>
-        <w:t xml:space="preserve"> c</w:t>
-      </w:r>
-      <w:r>
-        <w:rPr>
-          <w:sz w:val="28"/>
-          <w:szCs w:val="28"/>
-        </w:rPr>
-        <w:t>ủa</w:t>
-      </w:r>
-      <w:r>
-        <w:rPr>
-          <w:sz w:val="28"/>
-          <w:szCs w:val="28"/>
-        </w:rPr>
-        <w:t xml:space="preserve"> </w:t>
-      </w:r>
-      <w:r>
-        <w:rPr>
-          <w:sz w:val="28"/>
-          <w:szCs w:val="28"/>
-        </w:rPr>
-        <w:t>đảng</w:t>
-      </w:r>
-      <w:r>
-        <w:rPr>
-          <w:sz w:val="28"/>
-          <w:szCs w:val="28"/>
-        </w:rPr>
-        <w:t xml:space="preserve"> vi</w:t>
-      </w:r>
-      <w:r>
-        <w:rPr>
-          <w:sz w:val="28"/>
-          <w:szCs w:val="28"/>
-        </w:rPr>
-        <w:t>ên</w:t>
-      </w:r>
-      <w:r>
-        <w:rPr>
-          <w:sz w:val="28"/>
-          <w:szCs w:val="28"/>
-        </w:rPr>
-        <w:t xml:space="preserve"> d</w:t>
-      </w:r>
-      <w:r>
-        <w:rPr>
-          <w:sz w:val="28"/>
-          <w:szCs w:val="28"/>
-        </w:rPr>
-        <w:t>ự</w:t>
-      </w:r>
-      <w:r>
-        <w:rPr>
-          <w:sz w:val="28"/>
-          <w:szCs w:val="28"/>
-        </w:rPr>
-        <w:t xml:space="preserve"> b</w:t>
-      </w:r>
-      <w:r>
-        <w:rPr>
-          <w:sz w:val="28"/>
-          <w:szCs w:val="28"/>
-        </w:rPr>
-        <w:t>ị</w:t>
-      </w:r>
-      <w:r>
-        <w:rPr>
-          <w:sz w:val="28"/>
-          <w:szCs w:val="28"/>
-        </w:rPr>
-        <w:t>, t</w:t>
-      </w:r>
-      <w:r>
-        <w:rPr>
-          <w:sz w:val="28"/>
-          <w:szCs w:val="28"/>
-        </w:rPr>
-        <w:t>ô</w:t>
-      </w:r>
-      <w:r>
-        <w:rPr>
-          <w:sz w:val="28"/>
-          <w:szCs w:val="28"/>
-        </w:rPr>
-        <w:t xml:space="preserve">i </w:t>
-      </w:r>
-      <w:r>
-        <w:rPr>
-          <w:sz w:val="28"/>
-          <w:szCs w:val="28"/>
-        </w:rPr>
-        <w:t>đề</w:t>
-      </w:r>
-      <w:r>
-        <w:rPr>
-          <w:sz w:val="28"/>
-          <w:szCs w:val="28"/>
-        </w:rPr>
-        <w:t xml:space="preserve"> ngh</w:t>
-      </w:r>
-      <w:r>
-        <w:rPr>
-          <w:sz w:val="28"/>
-          <w:szCs w:val="28"/>
-        </w:rPr>
-        <w:t>ị</w:t>
-      </w:r>
-      <w:r>
-        <w:rPr>
-          <w:sz w:val="28"/>
-          <w:szCs w:val="28"/>
-        </w:rPr>
-        <w:t xml:space="preserve"> </w:t>
-      </w:r>
-      <w:r>
-        <w:rPr>
-          <w:sz w:val="28"/>
-          <w:szCs w:val="28"/>
-        </w:rPr>
-        <w:t>C</w:t>
-      </w:r>
-      <w:r>
-        <w:rPr>
-          <w:sz w:val="28"/>
-          <w:szCs w:val="28"/>
-        </w:rPr>
-        <w:t>hi b</w:t>
-      </w:r>
-      <w:r>
-        <w:rPr>
-          <w:sz w:val="28"/>
-          <w:szCs w:val="28"/>
-        </w:rPr>
-        <w:t>ộ</w:t>
-      </w:r>
-      <w:r>
-        <w:rPr>
-          <w:sz w:val="28"/>
-          <w:szCs w:val="28"/>
-        </w:rPr>
-        <w:t xml:space="preserve"> x</w:t>
-      </w:r>
-      <w:r>
-        <w:rPr>
-          <w:sz w:val="28"/>
-          <w:szCs w:val="28"/>
-        </w:rPr>
-        <w:t>ét</w:t>
-      </w:r>
-      <w:r>
-        <w:rPr>
-          <w:sz w:val="28"/>
-          <w:szCs w:val="28"/>
-        </w:rPr>
-        <w:t xml:space="preserve">, </w:t>
-      </w:r>
-      <w:r>
-        <w:rPr>
-          <w:sz w:val="28"/>
-          <w:szCs w:val="28"/>
-        </w:rPr>
-        <w:t>đề</w:t>
-      </w:r>
-      <w:r>
-        <w:rPr>
-          <w:sz w:val="28"/>
-          <w:szCs w:val="28"/>
-        </w:rPr>
-        <w:t xml:space="preserve"> ngh</w:t>
-      </w:r>
-      <w:r>
-        <w:rPr>
-          <w:sz w:val="28"/>
-          <w:szCs w:val="28"/>
-        </w:rPr>
-        <w:t>ị</w:t>
-      </w:r>
-      <w:r>
-        <w:rPr>
-          <w:sz w:val="28"/>
-          <w:szCs w:val="28"/>
-        </w:rPr>
-        <w:t xml:space="preserve"> c</w:t>
-      </w:r>
-      <w:r>
-        <w:rPr>
-          <w:sz w:val="28"/>
-          <w:szCs w:val="28"/>
-        </w:rPr>
-        <w:t>ông</w:t>
-      </w:r>
-      <w:r>
-        <w:rPr>
-          <w:sz w:val="28"/>
-          <w:szCs w:val="28"/>
-        </w:rPr>
-        <w:t xml:space="preserve"> nh</w:t>
-      </w:r>
-      <w:r>
-        <w:rPr>
-          <w:sz w:val="28"/>
-          <w:szCs w:val="28"/>
-        </w:rPr>
-        <w:t>ận</w:t>
-      </w:r>
-      <w:r>
-        <w:rPr>
-          <w:sz w:val="28"/>
-          <w:szCs w:val="28"/>
-        </w:rPr>
-        <w:t xml:space="preserve"> </w:t>
-      </w:r>
-      <w:r>
-        <w:rPr>
-          <w:sz w:val="28"/>
-          <w:szCs w:val="28"/>
-        </w:rPr>
-        <w:t>đồng</w:t>
-      </w:r>
-      <w:r>
-        <w:rPr>
-          <w:sz w:val="28"/>
-          <w:szCs w:val="28"/>
-        </w:rPr>
-        <w:t xml:space="preserve"> ch</w:t>
-      </w:r>
-      <w:r>
-        <w:rPr>
-          <w:sz w:val="28"/>
-          <w:szCs w:val="28"/>
-        </w:rPr>
-        <w:t>í</w:t>
-      </w:r>
-      <w:r>
-        <w:rPr>
-          <w:sz w:val="28"/>
-          <w:szCs w:val="28"/>
-        </w:rPr>
-        <w:t xml:space="preserve"> </w:t>
-      </w:r>
-      <w:r>
-        <w:rPr>
-          <w:sz w:val="28"/>
-          <w:szCs w:val="28"/>
-        </w:rPr>
         <w:t xml:space="preserve">{{ho_ten}} </w:t>
       </w:r>
       <w:r>
@@ -1047,91 +683,7 @@
           <w:sz w:val="28"/>
           <w:szCs w:val="28"/>
         </w:rPr>
-        <w:t>tr</w:t>
-      </w:r>
-      <w:r>
-        <w:rPr>
-          <w:sz w:val="28"/>
-          <w:szCs w:val="28"/>
-        </w:rPr>
-        <w:t>ở</w:t>
-      </w:r>
-      <w:r>
-        <w:rPr>
-          <w:sz w:val="28"/>
-          <w:szCs w:val="28"/>
-        </w:rPr>
-        <w:t xml:space="preserve"> th</w:t>
-      </w:r>
-      <w:r>
-        <w:rPr>
-          <w:sz w:val="28"/>
-          <w:szCs w:val="28"/>
-        </w:rPr>
-        <w:t>ành</w:t>
-      </w:r>
-      <w:r>
-        <w:rPr>
-          <w:sz w:val="28"/>
-          <w:szCs w:val="28"/>
-        </w:rPr>
-        <w:t xml:space="preserve"> </w:t>
-      </w:r>
-      <w:r>
-        <w:rPr>
-          <w:sz w:val="28"/>
-          <w:szCs w:val="28"/>
-        </w:rPr>
-        <w:t>đảng</w:t>
-      </w:r>
-      <w:r>
-        <w:rPr>
-          <w:sz w:val="28"/>
-          <w:szCs w:val="28"/>
-        </w:rPr>
-        <w:t xml:space="preserve"> vi</w:t>
-      </w:r>
-      <w:r>
-        <w:rPr>
-          <w:sz w:val="28"/>
-          <w:szCs w:val="28"/>
-        </w:rPr>
-        <w:t>ê</w:t>
-      </w:r>
-      <w:r>
-        <w:rPr>
-          <w:sz w:val="28"/>
-          <w:szCs w:val="28"/>
-        </w:rPr>
-        <w:t>n ch</w:t>
-      </w:r>
-      <w:r>
-        <w:rPr>
-          <w:sz w:val="28"/>
-          <w:szCs w:val="28"/>
-        </w:rPr>
-        <w:t>ính</w:t>
-      </w:r>
-      <w:r>
-        <w:rPr>
-          <w:sz w:val="28"/>
-          <w:szCs w:val="28"/>
-        </w:rPr>
-        <w:t xml:space="preserve"> th</w:t>
-      </w:r>
-      <w:r>
-        <w:rPr>
-          <w:sz w:val="28"/>
-          <w:szCs w:val="28"/>
-        </w:rPr>
-        <w:t>ức</w:t>
-      </w:r>
-      <w:r>
-        <w:rPr>
-          <w:sz w:val="28"/>
-          <w:szCs w:val="28"/>
-        </w:rPr>
-        <w:t>.</w:t>
+        <w:t>trở thành đảng viên chính thức.</w:t>
       </w:r>
     </w:p>
     <w:p>
@@ -1149,175 +701,7 @@
           <w:szCs w:val="28"/>
         </w:rPr>
         <w:tab/>
-        <w:t>T</w:t>
-      </w:r>
-      <w:r>
-        <w:rPr>
-          <w:sz w:val="28"/>
-          <w:szCs w:val="28"/>
-        </w:rPr>
-        <w:t>ô</w:t>
-      </w:r>
-      <w:r>
-        <w:rPr>
-          <w:sz w:val="28"/>
-          <w:szCs w:val="28"/>
-        </w:rPr>
-        <w:t>i xin ch</w:t>
-      </w:r>
-      <w:r>
-        <w:rPr>
-          <w:sz w:val="28"/>
-          <w:szCs w:val="28"/>
-        </w:rPr>
-        <w:t>ịu</w:t>
-      </w:r>
-      <w:r>
-        <w:rPr>
-          <w:sz w:val="28"/>
-          <w:szCs w:val="28"/>
-        </w:rPr>
-        <w:t xml:space="preserve"> tr</w:t>
-      </w:r>
-      <w:r>
-        <w:rPr>
-          <w:sz w:val="28"/>
-          <w:szCs w:val="28"/>
-        </w:rPr>
-        <w:t>ách</w:t>
-      </w:r>
-      <w:r>
-        <w:rPr>
-          <w:sz w:val="28"/>
-          <w:szCs w:val="28"/>
-        </w:rPr>
-        <w:t xml:space="preserve"> nhi</w:t>
-      </w:r>
-      <w:r>
-        <w:rPr>
-          <w:sz w:val="28"/>
-          <w:szCs w:val="28"/>
-        </w:rPr>
-        <w:t>ệm</w:t>
-      </w:r>
-      <w:r>
-        <w:rPr>
-          <w:sz w:val="28"/>
-          <w:szCs w:val="28"/>
-        </w:rPr>
-        <w:t xml:space="preserve"> tr</w:t>
-      </w:r>
-      <w:r>
-        <w:rPr>
-          <w:sz w:val="28"/>
-          <w:szCs w:val="28"/>
-        </w:rPr>
-        <w:t>ước</w:t>
-      </w:r>
-      <w:r>
-        <w:rPr>
-          <w:sz w:val="28"/>
-          <w:szCs w:val="28"/>
-        </w:rPr>
-        <w:t xml:space="preserve"> </w:t>
-      </w:r>
-      <w:r>
-        <w:rPr>
-          <w:sz w:val="28"/>
-          <w:szCs w:val="28"/>
-        </w:rPr>
-        <w:t>Đảng</w:t>
-      </w:r>
-      <w:r>
-        <w:rPr>
-          <w:sz w:val="28"/>
-          <w:szCs w:val="28"/>
-        </w:rPr>
-        <w:t xml:space="preserve"> v</w:t>
-      </w:r>
-      <w:r>
-        <w:rPr>
-          <w:sz w:val="28"/>
-          <w:szCs w:val="28"/>
-        </w:rPr>
-        <w:t>ề</w:t>
-      </w:r>
-      <w:r>
-        <w:rPr>
-          <w:sz w:val="28"/>
-          <w:szCs w:val="28"/>
-        </w:rPr>
-        <w:t xml:space="preserve"> l</w:t>
-      </w:r>
-      <w:r>
-        <w:rPr>
-          <w:sz w:val="28"/>
-          <w:szCs w:val="28"/>
-        </w:rPr>
-        <w:t>ời</w:t>
-      </w:r>
-      <w:r>
-        <w:rPr>
-          <w:sz w:val="28"/>
-          <w:szCs w:val="28"/>
-        </w:rPr>
-        <w:t xml:space="preserve"> nh</w:t>
-      </w:r>
-      <w:r>
-        <w:rPr>
-          <w:sz w:val="28"/>
-          <w:szCs w:val="28"/>
-        </w:rPr>
-        <w:t>ận</w:t>
-      </w:r>
-      <w:r>
-        <w:rPr>
-          <w:sz w:val="28"/>
-          <w:szCs w:val="28"/>
-        </w:rPr>
-        <w:t xml:space="preserve"> x</w:t>
-      </w:r>
-      <w:r>
-        <w:rPr>
-          <w:sz w:val="28"/>
-          <w:szCs w:val="28"/>
-        </w:rPr>
-        <w:t>ét</w:t>
-      </w:r>
-      <w:r>
-        <w:rPr>
-          <w:sz w:val="28"/>
-          <w:szCs w:val="28"/>
-        </w:rPr>
-        <w:t xml:space="preserve"> c</w:t>
-      </w:r>
-      <w:r>
-        <w:rPr>
-          <w:sz w:val="28"/>
-          <w:szCs w:val="28"/>
-        </w:rPr>
-        <w:t>ủa</w:t>
-      </w:r>
-      <w:r>
-        <w:rPr>
-          <w:sz w:val="28"/>
-          <w:szCs w:val="28"/>
-        </w:rPr>
-        <w:t xml:space="preserve"> m</w:t>
-      </w:r>
-      <w:r>
-        <w:rPr>
-          <w:sz w:val="28"/>
-          <w:szCs w:val="28"/>
-        </w:rPr>
-        <w:t>ình</w:t>
-      </w:r>
-      <w:r>
-        <w:rPr>
-          <w:sz w:val="28"/>
-          <w:szCs w:val="28"/>
-        </w:rPr>
-        <w:t>.</w:t>
+        <w:t>Tôi xin chịu trách nhiệm trước Đảng về lời nhận xét của mình.</w:t>
       </w:r>
     </w:p>
     <w:p>
@@ -1330,7 +714,25 @@
         </w:rPr>
       </w:pPr>
       <w:r>
-        <w:t xml:space="preserve">                                          {{tinh_tp}}, ngày {{ngay_ky_d}} tháng {{ngay_ky_m}} năm {{ngay_ky_y}}  </w:t>
+        <w:rPr>
+          <w:sz w:val="28"/>
+          <w:szCs w:val="28"/>
+        </w:rPr>
+        <w:t xml:space="preserve">                                          </w:t>
+      </w:r>
+      <w:r>
+        <w:rPr>
+          <w:sz w:val="28"/>
+          <w:szCs w:val="28"/>
+        </w:rPr>
+        <w:t xml:space="preserve">Đà Nẵng, ngày       tháng    </w:t>
+      </w:r>
+      <w:r>
+        <w:rPr>
+          <w:sz w:val="28"/>
+          <w:szCs w:val="28"/>
+        </w:rPr>
+        <w:t xml:space="preserve"> năm {{ngay_ky_y}}  </w:t>
       </w:r>
     </w:p>
     <w:p>
@@ -1407,33 +809,6 @@
           <w:szCs w:val="28"/>
         </w:rPr>
       </w:pPr>
-      <w:r>
-        <w:rPr>
-          <w:b/>
-          <w:bCs/>
-          <w:sz w:val="28"/>
-          <w:szCs w:val="28"/>
-        </w:rPr>
-        <w:t xml:space="preserve">    </w:t>
-      </w:r>
-      <w:r>
-        <w:rPr>
-          <w:b/>
-          <w:bCs/>
-          <w:sz w:val="28"/>
-          <w:szCs w:val="28"/>
-        </w:rPr>
-        <w:t xml:space="preserve"> </w:t>
-      </w:r>
-      <w:r>
-        <w:rPr>
-          <w:b/>
-          <w:bCs/>
-          <w:sz w:val="28"/>
-          <w:szCs w:val="28"/>
-        </w:rPr>
-        <w:t xml:space="preserve">  </w:t>
-      </w:r>
       <w:r>
         <w:rPr>
           <w:b/>

</xml_diff>